<commit_message>
Planning aanpassen: kort, samenvoegen
</commit_message>
<xml_diff>
--- a/Jaarplanner_mentorlessen_H4E_2026-2027.docx
+++ b/Jaarplanner_mentorlessen_H4E_2026-2027.docx
@@ -637,6 +637,113 @@
           <w:szCs w:val="20"/>
         </w:rPr>
         <w:t xml:space="preserve">Bij een gespreksmoment gaat de tool op slot. De leerling ziet dan een aanvraagcode (bijvoorbeeld 9-K7F3) en bereidt het gesprek voor in drie vragen. Na het gesprek typ jij de aanvraagcode en je pincode op de mentorpagina, en je geeft de leerling de vrijgavecode. Die code werkt alleen voor die leerling. Een leerling kan het gesprek al eerder hebben; hij ziet het in de lessen ervoor aankomen. Een MOL-gesprek mag meetellen. Standaard liggen de momenten vóór les 9, 17, 25: eind november, begin februari en half mei. Houd minstens acht lessen tussen twee momenten, anders haal je niet iedereen.</w:t>
+      </w:r>
+    </w:p>
+    <w:p>
+      <w:pPr>
+        <w:pStyle w:val="Heading2"/>
+        <w:keepNext/>
+        <w:spacing w:after="100" w:before="200"/>
+      </w:pPr>
+      <w:r>
+        <w:rPr>
+          <w:rFonts w:ascii="Calibri" w:cs="Calibri" w:eastAsia="Calibri" w:hAnsi="Calibri"/>
+        </w:rPr>
+        <w:t xml:space="preserve">Lessen inkorten of doorschuiven</w:t>
+      </w:r>
+    </w:p>
+    <w:p>
+      <w:pPr>
+        <w:spacing w:after="100" w:before="0" w:line="276"/>
+      </w:pPr>
+      <w:r>
+        <w:rPr>
+          <w:rFonts w:ascii="Calibri" w:cs="Calibri" w:eastAsia="Calibri" w:hAnsi="Calibri"/>
+          <w:color w:val="1F2328"/>
+          <w:sz w:val="20"/>
+          <w:szCs w:val="20"/>
+        </w:rPr>
+        <w:t xml:space="preserve">Word je ziek, valt een les uit of gaat er iets in de klas voor, dan pas je de planning aan op de pagina </w:t>
+      </w:r>
+      <w:r>
+        <w:rPr>
+          <w:rFonts w:ascii="Calibri" w:cs="Calibri" w:eastAsia="Calibri" w:hAnsi="Calibri"/>
+          <w:b/>
+          <w:bCs/>
+          <w:color w:val="1F2328"/>
+          <w:sz w:val="20"/>
+          <w:szCs w:val="20"/>
+        </w:rPr>
+        <w:t xml:space="preserve">Planning aanpassen</w:t>
+      </w:r>
+      <w:r>
+        <w:rPr>
+          <w:rFonts w:ascii="Calibri" w:cs="Calibri" w:eastAsia="Calibri" w:hAnsi="Calibri"/>
+          <w:color w:val="1F2328"/>
+          <w:sz w:val="20"/>
+          <w:szCs w:val="20"/>
+        </w:rPr>
+        <w:t xml:space="preserve"> in het mentorportaal. Per les kies je: </w:t>
+      </w:r>
+      <w:r>
+        <w:rPr>
+          <w:rFonts w:ascii="Calibri" w:cs="Calibri" w:eastAsia="Calibri" w:hAnsi="Calibri"/>
+          <w:b/>
+          <w:bCs/>
+          <w:color w:val="1F2328"/>
+          <w:sz w:val="20"/>
+          <w:szCs w:val="20"/>
+        </w:rPr>
+        <w:t xml:space="preserve">kort</w:t>
+      </w:r>
+      <w:r>
+        <w:rPr>
+          <w:rFonts w:ascii="Calibri" w:cs="Calibri" w:eastAsia="Calibri" w:hAnsi="Calibri"/>
+          <w:color w:val="1F2328"/>
+          <w:sz w:val="20"/>
+          <w:szCs w:val="20"/>
+        </w:rPr>
+        <w:t xml:space="preserve"> (alleen de kern, ongeveer tien minuten), </w:t>
+      </w:r>
+      <w:r>
+        <w:rPr>
+          <w:rFonts w:ascii="Calibri" w:cs="Calibri" w:eastAsia="Calibri" w:hAnsi="Calibri"/>
+          <w:b/>
+          <w:bCs/>
+          <w:color w:val="1F2328"/>
+          <w:sz w:val="20"/>
+          <w:szCs w:val="20"/>
+        </w:rPr>
+        <w:t xml:space="preserve">samenvoegen met de volgende les</w:t>
+      </w:r>
+      <w:r>
+        <w:rPr>
+          <w:rFonts w:ascii="Calibri" w:cs="Calibri" w:eastAsia="Calibri" w:hAnsi="Calibri"/>
+          <w:color w:val="1F2328"/>
+          <w:sz w:val="20"/>
+          <w:szCs w:val="20"/>
+        </w:rPr>
+        <w:t xml:space="preserve"> (die les wordt dan kort en bevat de kern van beide) of </w:t>
+      </w:r>
+      <w:r>
+        <w:rPr>
+          <w:rFonts w:ascii="Calibri" w:cs="Calibri" w:eastAsia="Calibri" w:hAnsi="Calibri"/>
+          <w:b/>
+          <w:bCs/>
+          <w:color w:val="1F2328"/>
+          <w:sz w:val="20"/>
+          <w:szCs w:val="20"/>
+        </w:rPr>
+        <w:t xml:space="preserve">zelfstandig</w:t>
+      </w:r>
+      <w:r>
+        <w:rPr>
+          <w:rFonts w:ascii="Calibri" w:cs="Calibri" w:eastAsia="Calibri" w:hAnsi="Calibri"/>
+          <w:color w:val="1F2328"/>
+          <w:sz w:val="20"/>
+          <w:szCs w:val="20"/>
+        </w:rPr>
+        <w:t xml:space="preserve"> (de les gaat door zonder mentor). Je plakt je huidige klaslink, kiest de aanpassingen en zet de nieuwe klaslink in Teams. Het werk van leerlingen blijft staan. Schuif lessen met een deadline liever niet door maar maak ze kort: de jaarlijn hangt vast aan de toetsweken en MOL-gesprekken. Bij onverwachte ziekte hoef je niets te doen; leerlingen kunnen elke les zelfstandig maken.</w:t>
       </w:r>
     </w:p>
     <w:p>

</xml_diff>

<commit_message>
Geen link naar mentorportaal in leerlingdeel
Co-Authored-By: Claude Opus 5 <noreply@anthropic.com>
Claude-Session: https://claude.ai/code/session_01ANGbdbaxhJNxHHij1urWpj
</commit_message>
<xml_diff>
--- a/Jaarplanner_mentorlessen_H4E_2026-2027.docx
+++ b/Jaarplanner_mentorlessen_H4E_2026-2027.docx
@@ -5066,7 +5066,7 @@
         <w:rPr>
           <w:rFonts w:ascii="Calibri" w:cs="Calibri" w:eastAsia="Calibri" w:hAnsi="Calibri"/>
         </w:rPr>
-        <w:t xml:space="preserve">Mentorpagina, klaslink en gespreksmomenten</w:t>
+        <w:t xml:space="preserve">Mentorportaal, klaslink en gespreksmomenten</w:t>
       </w:r>
     </w:p>
     <w:p>
@@ -5080,7 +5080,7 @@
           <w:sz w:val="20"/>
           <w:szCs w:val="20"/>
         </w:rPr>
-        <w:t xml:space="preserve">Onder aan de startpagina van de tool staat een link naar de </w:t>
+        <w:t xml:space="preserve">Mentoren gebruiken een eigen adres: </w:t>
       </w:r>
       <w:r>
         <w:rPr>
@@ -5091,7 +5091,7 @@
           <w:sz w:val="20"/>
           <w:szCs w:val="20"/>
         </w:rPr>
-        <w:t xml:space="preserve">mentorpagina</w:t>
+        <w:t xml:space="preserve">https://weerthuis-cloud.github.io/H4-mentoraat/#mentor</w:t>
       </w:r>
       <w:r>
         <w:rPr>
@@ -5100,7 +5100,7 @@
           <w:sz w:val="20"/>
           <w:szCs w:val="20"/>
         </w:rPr>
-        <w:t xml:space="preserve">. Daar maak je een klaslink: je kiest je klas, of je met de hele of de halve klas werkt, en vóór welke lessen een gesprek verplicht is. Je kiest ook een pincode van 4 tot 8 cijfers. Die staat niet in de link en kent alleen jij. Zet de klaslink in Teams. Leerlingen die de tool via die link openen, krijgen automatisch jouw instellingen.</w:t>
+        <w:t xml:space="preserve"> (het mentorportaal). Leerlingen zien daar geen link naar. Daar maak je een klaslink: je kiest je klas, of je met de hele of de halve klas werkt, en vóór welke lessen een gesprek verplicht is. Je kiest ook een pincode van 4 tot 8 cijfers. Die staat niet in de link en kent alleen jij. Zet de klaslink in Teams. Leerlingen die de tool via die link openen, krijgen automatisch jouw instellingen.</w:t>
       </w:r>
     </w:p>
     <w:p>

</xml_diff>